<commit_message>
Revisão dos casos de uso, adicionando, removendo e alterando fluxos e dados nos documentos. Renomeei um caso de uso de outra Issue(20) Close #19
</commit_message>
<xml_diff>
--- a/Requisitos/CSU05 - Fazer Pedido.docx
+++ b/Requisitos/CSU05 - Fazer Pedido.docx
@@ -1,6 +1,6 @@
 
 <file path=word/document.xml><?xml version="1.0" encoding="utf-8"?>
-<w:document xmlns:wpc="http://schemas.microsoft.com/office/word/2010/wordprocessingCanvas" xmlns:cx="http://schemas.microsoft.com/office/drawing/2014/chartex" xmlns:cx1="http://schemas.microsoft.com/office/drawing/2015/9/8/chartex" xmlns:cx2="http://schemas.microsoft.com/office/drawing/2015/10/21/chartex" xmlns:cx3="http://schemas.microsoft.com/office/drawing/2016/5/9/chartex" xmlns:cx4="http://schemas.microsoft.com/office/drawing/2016/5/10/chartex" xmlns:cx5="http://schemas.microsoft.com/office/drawing/2016/5/11/chartex" xmlns:cx6="http://schemas.microsoft.com/office/drawing/2016/5/12/chartex" xmlns:cx7="http://schemas.microsoft.com/office/drawing/2016/5/13/chartex" xmlns:cx8="http://schemas.microsoft.com/office/drawing/2016/5/14/chartex" xmlns:mc="http://schemas.openxmlformats.org/markup-compatibility/2006" xmlns:aink="http://schemas.microsoft.com/office/drawing/2016/ink" xmlns:am3d="http://schemas.microsoft.com/office/drawing/2017/model3d" xmlns:o="urn:schemas-microsoft-com:office:office" xmlns:r="http://schemas.openxmlformats.org/officeDocument/2006/relationships" xmlns:m="http://schemas.openxmlformats.org/officeDocument/2006/math" xmlns:v="urn:schemas-microsoft-com:vml" xmlns:wp14="http://schemas.microsoft.com/office/word/2010/wordprocessingDrawing" xmlns:wp="http://schemas.openxmlformats.org/drawingml/2006/wordprocessingDrawing" xmlns:w10="urn:schemas-microsoft-com:office:word" xmlns:w="http://schemas.openxmlformats.org/wordprocessingml/2006/main" xmlns:w14="http://schemas.microsoft.com/office/word/2010/wordml" xmlns:w15="http://schemas.microsoft.com/office/word/2012/wordml" xmlns:w16cex="http://schemas.microsoft.com/office/word/2018/wordml/cex" xmlns:w16cid="http://schemas.microsoft.com/office/word/2016/wordml/cid" xmlns:w16="http://schemas.microsoft.com/office/word/2018/wordml" xmlns:w16se="http://schemas.microsoft.com/office/word/2015/wordml/symex" xmlns:wpg="http://schemas.microsoft.com/office/word/2010/wordprocessingGroup" xmlns:wpi="http://schemas.microsoft.com/office/word/2010/wordprocessingInk" xmlns:wne="http://schemas.microsoft.com/office/word/2006/wordml" xmlns:wps="http://schemas.microsoft.com/office/word/2010/wordprocessingShape" mc:Ignorable="w14 w15 w16se w16cid w16 w16cex wp14">
+<w:document xmlns:wpc="http://schemas.microsoft.com/office/word/2010/wordprocessingCanvas" xmlns:cx="http://schemas.microsoft.com/office/drawing/2014/chartex" xmlns:cx1="http://schemas.microsoft.com/office/drawing/2015/9/8/chartex" xmlns:cx2="http://schemas.microsoft.com/office/drawing/2015/10/21/chartex" xmlns:cx3="http://schemas.microsoft.com/office/drawing/2016/5/9/chartex" xmlns:cx4="http://schemas.microsoft.com/office/drawing/2016/5/10/chartex" xmlns:cx5="http://schemas.microsoft.com/office/drawing/2016/5/11/chartex" xmlns:cx6="http://schemas.microsoft.com/office/drawing/2016/5/12/chartex" xmlns:cx7="http://schemas.microsoft.com/office/drawing/2016/5/13/chartex" xmlns:cx8="http://schemas.microsoft.com/office/drawing/2016/5/14/chartex" xmlns:mc="http://schemas.openxmlformats.org/markup-compatibility/2006" xmlns:aink="http://schemas.microsoft.com/office/drawing/2016/ink" xmlns:am3d="http://schemas.microsoft.com/office/drawing/2017/model3d" xmlns:o="urn:schemas-microsoft-com:office:office" xmlns:oel="http://schemas.microsoft.com/office/2019/extlst" xmlns:r="http://schemas.openxmlformats.org/officeDocument/2006/relationships" xmlns:m="http://schemas.openxmlformats.org/officeDocument/2006/math" xmlns:v="urn:schemas-microsoft-com:vml" xmlns:wp14="http://schemas.microsoft.com/office/word/2010/wordprocessingDrawing" xmlns:wp="http://schemas.openxmlformats.org/drawingml/2006/wordprocessingDrawing" xmlns:w10="urn:schemas-microsoft-com:office:word" xmlns:w="http://schemas.openxmlformats.org/wordprocessingml/2006/main" xmlns:w14="http://schemas.microsoft.com/office/word/2010/wordml" xmlns:w15="http://schemas.microsoft.com/office/word/2012/wordml" xmlns:w16cex="http://schemas.microsoft.com/office/word/2018/wordml/cex" xmlns:w16cid="http://schemas.microsoft.com/office/word/2016/wordml/cid" xmlns:w16="http://schemas.microsoft.com/office/word/2018/wordml" xmlns:w16du="http://schemas.microsoft.com/office/word/2023/wordml/word16du" xmlns:w16sdtdh="http://schemas.microsoft.com/office/word/2020/wordml/sdtdatahash" xmlns:w16sdtfl="http://schemas.microsoft.com/office/word/2024/wordml/sdtformatlock" xmlns:w16se="http://schemas.microsoft.com/office/word/2015/wordml/symex" xmlns:wpg="http://schemas.microsoft.com/office/word/2010/wordprocessingGroup" xmlns:wpi="http://schemas.microsoft.com/office/word/2010/wordprocessingInk" xmlns:wne="http://schemas.microsoft.com/office/word/2006/wordml" xmlns:wps="http://schemas.microsoft.com/office/word/2010/wordprocessingShape" mc:Ignorable="w14 w15 w16se w16cid w16 w16cex w16sdtdh w16sdtfl w16du wp14">
   <w:body>
     <w:p>
       <w:pPr>
@@ -18,34 +18,7 @@
           <w:sz w:val="36"/>
           <w:szCs w:val="36"/>
         </w:rPr>
-        <w:t>CSU0</w:t>
-      </w:r>
-      <w:r>
-        <w:rPr>
-          <w:b/>
-          <w:color w:val="FF0000"/>
-          <w:sz w:val="36"/>
-          <w:szCs w:val="36"/>
-        </w:rPr>
-        <w:t>5</w:t>
-      </w:r>
-      <w:r>
-        <w:rPr>
-          <w:b/>
-          <w:color w:val="FF0000"/>
-          <w:sz w:val="36"/>
-          <w:szCs w:val="36"/>
-        </w:rPr>
-        <w:t>:</w:t>
-      </w:r>
-      <w:r>
-        <w:rPr>
-          <w:b/>
-          <w:color w:val="FF0000"/>
-          <w:sz w:val="36"/>
-          <w:szCs w:val="36"/>
-        </w:rPr>
-        <w:t xml:space="preserve"> </w:t>
+        <w:t xml:space="preserve">CSU05: </w:t>
       </w:r>
       <w:r>
         <w:rPr>
@@ -105,7 +78,6 @@
               <w:bottom w:val="single" w:sz="4" w:space="0" w:color="000000"/>
               <w:right w:val="single" w:sz="4" w:space="0" w:color="000000"/>
             </w:tcBorders>
-            <w:shd w:val="clear" w:color="auto" w:fill="auto"/>
           </w:tcPr>
           <w:p>
             <w:r>
@@ -127,7 +99,6 @@
               <w:bottom w:val="single" w:sz="4" w:space="0" w:color="000000"/>
               <w:right w:val="single" w:sz="4" w:space="0" w:color="000000"/>
             </w:tcBorders>
-            <w:shd w:val="clear" w:color="auto" w:fill="auto"/>
           </w:tcPr>
           <w:p>
             <w:pPr>
@@ -141,22 +112,10 @@
               <w:rPr>
                 <w:b w:val="0"/>
               </w:rPr>
-              <w:t>90</w:t>
-            </w:r>
-            <w:r>
-              <w:rPr>
-                <w:b w:val="0"/>
-              </w:rPr>
-              <w:t xml:space="preserve"> (</w:t>
-            </w:r>
-            <w:r>
-              <w:t xml:space="preserve">Risco </w:t>
-            </w:r>
-            <w:r>
-              <w:t>Alto</w:t>
-            </w:r>
-            <w:r>
-              <w:t xml:space="preserve"> e Prioridade Alta)</w:t>
+              <w:t>90 (</w:t>
+            </w:r>
+            <w:r>
+              <w:t>Risco Alto e Prioridade Alta)</w:t>
             </w:r>
           </w:p>
         </w:tc>
@@ -171,7 +130,6 @@
               <w:bottom w:val="single" w:sz="4" w:space="0" w:color="000000"/>
               <w:right w:val="single" w:sz="4" w:space="0" w:color="000000"/>
             </w:tcBorders>
-            <w:shd w:val="clear" w:color="auto" w:fill="auto"/>
           </w:tcPr>
           <w:p>
             <w:r>
@@ -193,7 +151,6 @@
               <w:bottom w:val="single" w:sz="4" w:space="0" w:color="000000"/>
               <w:right w:val="single" w:sz="4" w:space="0" w:color="000000"/>
             </w:tcBorders>
-            <w:shd w:val="clear" w:color="auto" w:fill="auto"/>
           </w:tcPr>
           <w:p>
             <w:r>
@@ -216,7 +173,6 @@
               <w:bottom w:val="single" w:sz="4" w:space="0" w:color="000000"/>
               <w:right w:val="single" w:sz="4" w:space="0" w:color="000000"/>
             </w:tcBorders>
-            <w:shd w:val="clear" w:color="auto" w:fill="auto"/>
           </w:tcPr>
           <w:p>
             <w:r>
@@ -238,7 +194,6 @@
               <w:bottom w:val="single" w:sz="4" w:space="0" w:color="000000"/>
               <w:right w:val="single" w:sz="4" w:space="0" w:color="000000"/>
             </w:tcBorders>
-            <w:shd w:val="clear" w:color="auto" w:fill="auto"/>
           </w:tcPr>
           <w:p>
             <w:r>
@@ -261,7 +216,6 @@
               <w:bottom w:val="single" w:sz="4" w:space="0" w:color="000000"/>
               <w:right w:val="single" w:sz="4" w:space="0" w:color="000000"/>
             </w:tcBorders>
-            <w:shd w:val="clear" w:color="auto" w:fill="auto"/>
           </w:tcPr>
           <w:p>
             <w:r>
@@ -283,7 +237,6 @@
               <w:bottom w:val="single" w:sz="4" w:space="0" w:color="000000"/>
               <w:right w:val="single" w:sz="4" w:space="0" w:color="000000"/>
             </w:tcBorders>
-            <w:shd w:val="clear" w:color="auto" w:fill="auto"/>
           </w:tcPr>
           <w:p>
             <w:r>
@@ -306,7 +259,6 @@
               <w:bottom w:val="single" w:sz="4" w:space="0" w:color="000000"/>
               <w:right w:val="single" w:sz="4" w:space="0" w:color="000000"/>
             </w:tcBorders>
-            <w:shd w:val="clear" w:color="auto" w:fill="auto"/>
           </w:tcPr>
           <w:p>
             <w:r>
@@ -328,7 +280,6 @@
               <w:bottom w:val="single" w:sz="4" w:space="0" w:color="000000"/>
               <w:right w:val="single" w:sz="4" w:space="0" w:color="000000"/>
             </w:tcBorders>
-            <w:shd w:val="clear" w:color="auto" w:fill="auto"/>
           </w:tcPr>
           <w:p>
             <w:r>
@@ -368,7 +319,6 @@
               <w:bottom w:val="single" w:sz="4" w:space="0" w:color="000000"/>
               <w:right w:val="single" w:sz="4" w:space="0" w:color="000000"/>
             </w:tcBorders>
-            <w:shd w:val="clear" w:color="auto" w:fill="auto"/>
           </w:tcPr>
           <w:p>
             <w:r>
@@ -390,7 +340,6 @@
               <w:bottom w:val="single" w:sz="4" w:space="0" w:color="000000"/>
               <w:right w:val="single" w:sz="4" w:space="0" w:color="000000"/>
             </w:tcBorders>
-            <w:shd w:val="clear" w:color="auto" w:fill="auto"/>
           </w:tcPr>
           <w:p>
             <w:r>
@@ -418,7 +367,6 @@
               <w:bottom w:val="single" w:sz="4" w:space="0" w:color="000000"/>
               <w:right w:val="single" w:sz="4" w:space="0" w:color="000000"/>
             </w:tcBorders>
-            <w:shd w:val="clear" w:color="auto" w:fill="auto"/>
           </w:tcPr>
           <w:p>
             <w:pPr>
@@ -451,7 +399,6 @@
               <w:bottom w:val="single" w:sz="4" w:space="0" w:color="000000"/>
               <w:right w:val="single" w:sz="4" w:space="0" w:color="000000"/>
             </w:tcBorders>
-            <w:shd w:val="clear" w:color="auto" w:fill="auto"/>
           </w:tcPr>
           <w:p>
             <w:pPr>
@@ -495,7 +442,14 @@
                 <w:sz w:val="28"/>
                 <w:szCs w:val="28"/>
               </w:rPr>
-              <w:t>2. Ator seleciona um refeição</w:t>
+              <w:t xml:space="preserve">2. Ator seleciona um </w:t>
+            </w:r>
+            <w:r>
+              <w:rPr>
+                <w:sz w:val="28"/>
+                <w:szCs w:val="28"/>
+              </w:rPr>
+              <w:t>Item</w:t>
             </w:r>
           </w:p>
           <w:p>
@@ -511,8 +465,38 @@
                 <w:sz w:val="28"/>
                 <w:szCs w:val="28"/>
               </w:rPr>
-              <w:t>3. Sistema exibe tela de “Refeição”(</w:t>
-            </w:r>
+              <w:t>3. Sistema exibe tela d</w:t>
+            </w:r>
+            <w:r>
+              <w:rPr>
+                <w:sz w:val="28"/>
+                <w:szCs w:val="28"/>
+              </w:rPr>
+              <w:t>o</w:t>
+            </w:r>
+            <w:r>
+              <w:rPr>
+                <w:sz w:val="28"/>
+                <w:szCs w:val="28"/>
+              </w:rPr>
+              <w:t xml:space="preserve"> “</w:t>
+            </w:r>
+            <w:proofErr w:type="gramStart"/>
+            <w:r>
+              <w:rPr>
+                <w:sz w:val="28"/>
+                <w:szCs w:val="28"/>
+              </w:rPr>
+              <w:t>Item</w:t>
+            </w:r>
+            <w:r>
+              <w:rPr>
+                <w:sz w:val="28"/>
+                <w:szCs w:val="28"/>
+              </w:rPr>
+              <w:t>”(</w:t>
+            </w:r>
+            <w:proofErr w:type="gramEnd"/>
             <w:r>
               <w:rPr>
                 <w:color w:val="FF0000"/>
@@ -553,12 +537,35 @@
                 <w:szCs w:val="28"/>
               </w:rPr>
             </w:pPr>
-            <w:r>
-              <w:rPr>
-                <w:sz w:val="28"/>
-                <w:szCs w:val="28"/>
-              </w:rPr>
-              <w:t>5 .Sistema adiciona uma refeição ao carrinho</w:t>
+            <w:proofErr w:type="gramStart"/>
+            <w:r>
+              <w:rPr>
+                <w:sz w:val="28"/>
+                <w:szCs w:val="28"/>
+              </w:rPr>
+              <w:t>5 .Sistema</w:t>
+            </w:r>
+            <w:proofErr w:type="gramEnd"/>
+            <w:r>
+              <w:rPr>
+                <w:sz w:val="28"/>
+                <w:szCs w:val="28"/>
+              </w:rPr>
+              <w:t xml:space="preserve"> adiciona um</w:t>
+            </w:r>
+            <w:r>
+              <w:rPr>
+                <w:sz w:val="28"/>
+                <w:szCs w:val="28"/>
+              </w:rPr>
+              <w:t xml:space="preserve"> Item </w:t>
+            </w:r>
+            <w:r>
+              <w:rPr>
+                <w:sz w:val="28"/>
+                <w:szCs w:val="28"/>
+              </w:rPr>
+              <w:t>ao carrinho</w:t>
             </w:r>
           </w:p>
           <w:p>
@@ -590,8 +597,17 @@
                 <w:sz w:val="28"/>
                 <w:szCs w:val="28"/>
               </w:rPr>
-              <w:t>7. Sistema exibe tela “Realizar Compra”(</w:t>
-            </w:r>
+              <w:t xml:space="preserve">7. Sistema exibe tela “Realizar </w:t>
+            </w:r>
+            <w:proofErr w:type="gramStart"/>
+            <w:r>
+              <w:rPr>
+                <w:sz w:val="28"/>
+                <w:szCs w:val="28"/>
+              </w:rPr>
+              <w:t>Compra”(</w:t>
+            </w:r>
+            <w:proofErr w:type="gramEnd"/>
             <w:r>
               <w:rPr>
                 <w:color w:val="FF0000"/>
@@ -637,8 +653,17 @@
                 <w:sz w:val="28"/>
                 <w:szCs w:val="28"/>
               </w:rPr>
-              <w:t>9. Sistema exibe tela “Forma de pagamento”(</w:t>
-            </w:r>
+              <w:t xml:space="preserve">9. Sistema exibe tela “Forma de </w:t>
+            </w:r>
+            <w:proofErr w:type="gramStart"/>
+            <w:r>
+              <w:rPr>
+                <w:sz w:val="28"/>
+                <w:szCs w:val="28"/>
+              </w:rPr>
+              <w:t>pagamento”(</w:t>
+            </w:r>
+            <w:proofErr w:type="gramEnd"/>
             <w:r>
               <w:rPr>
                 <w:color w:val="FF0000"/>
@@ -684,8 +709,17 @@
                 <w:sz w:val="28"/>
                 <w:szCs w:val="28"/>
               </w:rPr>
-              <w:t>11. Sistema exibe tela de “Realizar Compra”(</w:t>
-            </w:r>
+              <w:t xml:space="preserve">11. Sistema exibe tela de “Realizar </w:t>
+            </w:r>
+            <w:proofErr w:type="gramStart"/>
+            <w:r>
+              <w:rPr>
+                <w:sz w:val="28"/>
+                <w:szCs w:val="28"/>
+              </w:rPr>
+              <w:t>Compra”(</w:t>
+            </w:r>
+            <w:proofErr w:type="gramEnd"/>
             <w:r>
               <w:rPr>
                 <w:color w:val="FF0000"/>
@@ -734,7 +768,6 @@
               <w:bottom w:val="single" w:sz="4" w:space="0" w:color="000000"/>
               <w:right w:val="single" w:sz="4" w:space="0" w:color="000000"/>
             </w:tcBorders>
-            <w:shd w:val="clear" w:color="auto" w:fill="auto"/>
           </w:tcPr>
           <w:p>
             <w:pPr>
@@ -767,7 +800,6 @@
               <w:bottom w:val="single" w:sz="4" w:space="0" w:color="000000"/>
               <w:right w:val="single" w:sz="4" w:space="0" w:color="000000"/>
             </w:tcBorders>
-            <w:shd w:val="clear" w:color="auto" w:fill="auto"/>
           </w:tcPr>
           <w:p>
             <w:pPr>
@@ -792,13 +824,7 @@
               <w:rPr>
                 <w:color w:val="FF0000"/>
               </w:rPr>
-              <w:t>S</w:t>
-            </w:r>
-            <w:r>
-              <w:rPr>
-                <w:color w:val="FF0000"/>
-              </w:rPr>
-              <w:t>eção Estabelecimento</w:t>
+              <w:t>Seção Estabelecimento</w:t>
             </w:r>
           </w:p>
           <w:p>
@@ -899,14 +925,7 @@
                 <w:sz w:val="28"/>
                 <w:szCs w:val="28"/>
               </w:rPr>
-              <w:t>: Ator seleciona o ícone “Vol</w:t>
-            </w:r>
-            <w:r>
-              <w:rPr>
-                <w:sz w:val="28"/>
-                <w:szCs w:val="28"/>
-              </w:rPr>
-              <w:t>tar”. Retorna ao passo 1.</w:t>
+              <w:t>: Ator seleciona o ícone “Voltar”. Retorna ao passo 1.</w:t>
             </w:r>
           </w:p>
           <w:p>
@@ -929,8 +948,24 @@
                 <w:sz w:val="28"/>
                 <w:szCs w:val="28"/>
               </w:rPr>
-              <w:t>: Ator seleciona o ícone “Voltar”. Retorna a tela “Refeição”(</w:t>
-            </w:r>
+              <w:t>: Ator seleciona o ícone “Voltar”. Retorna a tela “</w:t>
+            </w:r>
+            <w:proofErr w:type="gramStart"/>
+            <w:r>
+              <w:rPr>
+                <w:sz w:val="28"/>
+                <w:szCs w:val="28"/>
+              </w:rPr>
+              <w:t>Item</w:t>
+            </w:r>
+            <w:r>
+              <w:rPr>
+                <w:sz w:val="28"/>
+                <w:szCs w:val="28"/>
+              </w:rPr>
+              <w:t>”(</w:t>
+            </w:r>
+            <w:proofErr w:type="gramEnd"/>
             <w:r>
               <w:rPr>
                 <w:color w:val="FF0000"/>
@@ -961,8 +996,17 @@
                 <w:sz w:val="28"/>
                 <w:szCs w:val="28"/>
               </w:rPr>
-              <w:t>Ator seleciona o ícone “Voltar”. Retorna a tela “Realizar Compra”(</w:t>
-            </w:r>
+              <w:t xml:space="preserve">Ator seleciona o ícone “Voltar”. Retorna a tela “Realizar </w:t>
+            </w:r>
+            <w:proofErr w:type="gramStart"/>
+            <w:r>
+              <w:rPr>
+                <w:sz w:val="28"/>
+                <w:szCs w:val="28"/>
+              </w:rPr>
+              <w:t>Compra”(</w:t>
+            </w:r>
+            <w:proofErr w:type="gramEnd"/>
             <w:r>
               <w:rPr>
                 <w:color w:val="FF0000"/>
@@ -995,7 +1039,6 @@
               <w:bottom w:val="single" w:sz="4" w:space="0" w:color="000000"/>
               <w:right w:val="single" w:sz="4" w:space="0" w:color="000000"/>
             </w:tcBorders>
-            <w:shd w:val="clear" w:color="auto" w:fill="auto"/>
           </w:tcPr>
           <w:p>
             <w:pPr>
@@ -1027,7 +1070,6 @@
               <w:bottom w:val="single" w:sz="4" w:space="0" w:color="000000"/>
               <w:right w:val="single" w:sz="4" w:space="0" w:color="000000"/>
             </w:tcBorders>
-            <w:shd w:val="clear" w:color="auto" w:fill="auto"/>
           </w:tcPr>
           <w:p>
             <w:pPr>
@@ -1079,6 +1121,26 @@
     </w:p>
     <w:p>
       <w:pPr>
+        <w:jc w:val="center"/>
+      </w:pPr>
+    </w:p>
+    <w:p>
+      <w:pPr>
+        <w:jc w:val="center"/>
+      </w:pPr>
+    </w:p>
+    <w:p>
+      <w:pPr>
+        <w:jc w:val="center"/>
+      </w:pPr>
+    </w:p>
+    <w:p>
+      <w:pPr>
+        <w:jc w:val="center"/>
+      </w:pPr>
+    </w:p>
+    <w:p>
+      <w:pPr>
         <w:pStyle w:val="Ttulo1"/>
         <w:numPr>
           <w:ilvl w:val="0"/>
@@ -1086,6 +1148,7 @@
         </w:numPr>
       </w:pPr>
       <w:r>
+        <w:lastRenderedPageBreak/>
         <w:t xml:space="preserve">Seção: </w:t>
       </w:r>
       <w:r>
@@ -1117,7 +1180,6 @@
               <w:bottom w:val="single" w:sz="4" w:space="0" w:color="000000"/>
               <w:right w:val="single" w:sz="4" w:space="0" w:color="000000"/>
             </w:tcBorders>
-            <w:shd w:val="clear" w:color="auto" w:fill="auto"/>
           </w:tcPr>
           <w:p>
             <w:r>
@@ -1139,7 +1201,6 @@
               <w:bottom w:val="single" w:sz="4" w:space="0" w:color="000000"/>
               <w:right w:val="single" w:sz="4" w:space="0" w:color="000000"/>
             </w:tcBorders>
-            <w:shd w:val="clear" w:color="auto" w:fill="auto"/>
           </w:tcPr>
           <w:p>
             <w:r>
@@ -1166,7 +1227,6 @@
               <w:bottom w:val="single" w:sz="4" w:space="0" w:color="000000"/>
               <w:right w:val="single" w:sz="4" w:space="0" w:color="000000"/>
             </w:tcBorders>
-            <w:shd w:val="clear" w:color="auto" w:fill="auto"/>
           </w:tcPr>
           <w:p>
             <w:pPr>
@@ -1182,7 +1242,6 @@
               <w:rPr>
                 <w:b/>
               </w:rPr>
-              <w:lastRenderedPageBreak/>
               <w:t>Fluxo Principal</w:t>
             </w:r>
           </w:p>
@@ -1202,7 +1261,6 @@
               <w:bottom w:val="single" w:sz="4" w:space="0" w:color="000000"/>
               <w:right w:val="single" w:sz="4" w:space="0" w:color="000000"/>
             </w:tcBorders>
-            <w:shd w:val="clear" w:color="auto" w:fill="auto"/>
           </w:tcPr>
           <w:p>
             <w:pPr>
@@ -1221,8 +1279,17 @@
                 <w:sz w:val="28"/>
                 <w:szCs w:val="28"/>
               </w:rPr>
-              <w:t>Sistema exibe tela de “Estabelecimento”(</w:t>
-            </w:r>
+              <w:t>Sistema exibe tela de “</w:t>
+            </w:r>
+            <w:proofErr w:type="gramStart"/>
+            <w:r>
+              <w:rPr>
+                <w:sz w:val="28"/>
+                <w:szCs w:val="28"/>
+              </w:rPr>
+              <w:t>Estabelecimento”(</w:t>
+            </w:r>
+            <w:proofErr w:type="gramEnd"/>
             <w:r>
               <w:rPr>
                 <w:color w:val="FF0000"/>
@@ -1256,7 +1323,21 @@
                 <w:sz w:val="28"/>
                 <w:szCs w:val="28"/>
               </w:rPr>
-              <w:t xml:space="preserve">Ator seleciona uma refeição. Ver passo 3 da </w:t>
+              <w:t>Ator seleciona u</w:t>
+            </w:r>
+            <w:r>
+              <w:rPr>
+                <w:sz w:val="28"/>
+                <w:szCs w:val="28"/>
+              </w:rPr>
+              <w:t>m Item</w:t>
+            </w:r>
+            <w:r>
+              <w:rPr>
+                <w:sz w:val="28"/>
+                <w:szCs w:val="28"/>
+              </w:rPr>
+              <w:t xml:space="preserve">. Ver passo 3 da </w:t>
             </w:r>
             <w:r>
               <w:rPr>
@@ -1283,7 +1364,6 @@
               <w:bottom w:val="single" w:sz="4" w:space="0" w:color="000000"/>
               <w:right w:val="single" w:sz="4" w:space="0" w:color="000000"/>
             </w:tcBorders>
-            <w:shd w:val="clear" w:color="auto" w:fill="auto"/>
           </w:tcPr>
           <w:p>
             <w:pPr>
@@ -1317,7 +1397,6 @@
               <w:bottom w:val="single" w:sz="4" w:space="0" w:color="000000"/>
               <w:right w:val="single" w:sz="4" w:space="0" w:color="000000"/>
             </w:tcBorders>
-            <w:shd w:val="clear" w:color="auto" w:fill="auto"/>
           </w:tcPr>
           <w:p>
             <w:pPr>
@@ -1338,8 +1417,17 @@
                 <w:sz w:val="28"/>
                 <w:szCs w:val="28"/>
               </w:rPr>
-              <w:t xml:space="preserve">  Ator seleciona o botão “Voltar”. Retorna a tela inicial do sistema(</w:t>
-            </w:r>
+              <w:t xml:space="preserve">  Ator seleciona o botão “Voltar”. Retorna a tela inicial do </w:t>
+            </w:r>
+            <w:proofErr w:type="gramStart"/>
+            <w:r>
+              <w:rPr>
+                <w:sz w:val="28"/>
+                <w:szCs w:val="28"/>
+              </w:rPr>
+              <w:t>sistema(</w:t>
+            </w:r>
+            <w:proofErr w:type="gramEnd"/>
             <w:r>
               <w:rPr>
                 <w:color w:val="FF0000"/>
@@ -1372,7 +1460,6 @@
               <w:bottom w:val="single" w:sz="4" w:space="0" w:color="000000"/>
               <w:right w:val="single" w:sz="4" w:space="0" w:color="000000"/>
             </w:tcBorders>
-            <w:shd w:val="clear" w:color="auto" w:fill="auto"/>
           </w:tcPr>
           <w:p>
             <w:pPr>
@@ -1411,7 +1498,6 @@
               <w:bottom w:val="single" w:sz="4" w:space="0" w:color="000000"/>
               <w:right w:val="single" w:sz="4" w:space="0" w:color="000000"/>
             </w:tcBorders>
-            <w:shd w:val="clear" w:color="auto" w:fill="auto"/>
           </w:tcPr>
           <w:p>
             <w:pPr>
@@ -1439,7 +1525,16 @@
                 <w:sz w:val="28"/>
                 <w:szCs w:val="28"/>
               </w:rPr>
-              <w:t>Sistema está fora do ar, exibindo a mensagem: “Sistema indisponível!”. Retorna a tela inicial do sistema</w:t>
+              <w:t xml:space="preserve">Sistema está fora do ar, exibindo a mensagem: “Sistema indisponível!”. Retorna a tela inicial do </w:t>
+            </w:r>
+            <w:proofErr w:type="gramStart"/>
+            <w:r>
+              <w:rPr>
+                <w:bCs/>
+                <w:sz w:val="28"/>
+                <w:szCs w:val="28"/>
+              </w:rPr>
+              <w:t>sistema</w:t>
             </w:r>
             <w:r>
               <w:rPr>
@@ -1448,6 +1543,7 @@
               </w:rPr>
               <w:t>(</w:t>
             </w:r>
+            <w:proofErr w:type="gramEnd"/>
             <w:r>
               <w:rPr>
                 <w:color w:val="FF0000"/>
@@ -1463,8 +1559,6 @@
               </w:rPr>
               <w:t>).</w:t>
             </w:r>
-            <w:bookmarkStart w:id="5" w:name="_GoBack"/>
-            <w:bookmarkEnd w:id="5"/>
           </w:p>
         </w:tc>
       </w:tr>
@@ -1487,8 +1581,8 @@
           <w:numId w:val="1"/>
         </w:numPr>
       </w:pPr>
-      <w:bookmarkStart w:id="6" w:name="_heading=h.nfnumzn6v38n" w:colFirst="0" w:colLast="0"/>
-      <w:bookmarkEnd w:id="6"/>
+      <w:bookmarkStart w:id="5" w:name="_heading=h.nfnumzn6v38n" w:colFirst="0" w:colLast="0"/>
+      <w:bookmarkEnd w:id="5"/>
       <w:r>
         <w:t xml:space="preserve">Seção: </w:t>
       </w:r>
@@ -1505,7 +1599,6 @@
         <w:id w:val="1644474069"/>
         <w:lock w:val="contentLocked"/>
       </w:sdtPr>
-      <w:sdtEndPr/>
       <w:sdtContent>
         <w:tbl>
           <w:tblPr>
@@ -1529,7 +1622,6 @@
                   <w:bottom w:val="single" w:sz="4" w:space="0" w:color="000000"/>
                   <w:right w:val="single" w:sz="4" w:space="0" w:color="000000"/>
                 </w:tcBorders>
-                <w:shd w:val="clear" w:color="auto" w:fill="auto"/>
               </w:tcPr>
               <w:p>
                 <w:r>
@@ -1551,7 +1643,6 @@
                   <w:bottom w:val="single" w:sz="4" w:space="0" w:color="000000"/>
                   <w:right w:val="single" w:sz="4" w:space="0" w:color="000000"/>
                 </w:tcBorders>
-                <w:shd w:val="clear" w:color="auto" w:fill="auto"/>
               </w:tcPr>
               <w:p>
                 <w:r>
@@ -1578,7 +1669,6 @@
                   <w:bottom w:val="single" w:sz="4" w:space="0" w:color="000000"/>
                   <w:right w:val="single" w:sz="4" w:space="0" w:color="000000"/>
                 </w:tcBorders>
-                <w:shd w:val="clear" w:color="auto" w:fill="auto"/>
               </w:tcPr>
               <w:p>
                 <w:pPr>
@@ -1588,8 +1678,8 @@
                     <w:numId w:val="1"/>
                   </w:numPr>
                 </w:pPr>
-                <w:bookmarkStart w:id="7" w:name="_heading=h.afudk3dni58d" w:colFirst="0" w:colLast="0"/>
-                <w:bookmarkEnd w:id="7"/>
+                <w:bookmarkStart w:id="6" w:name="_heading=h.afudk3dni58d" w:colFirst="0" w:colLast="0"/>
+                <w:bookmarkEnd w:id="6"/>
                 <w:r>
                   <w:rPr>
                     <w:b/>
@@ -1613,7 +1703,6 @@
                   <w:bottom w:val="single" w:sz="4" w:space="0" w:color="000000"/>
                   <w:right w:val="single" w:sz="4" w:space="0" w:color="000000"/>
                 </w:tcBorders>
-                <w:shd w:val="clear" w:color="auto" w:fill="auto"/>
               </w:tcPr>
               <w:p>
                 <w:pPr>
@@ -1684,7 +1773,6 @@
                   <w:bottom w:val="single" w:sz="4" w:space="0" w:color="000000"/>
                   <w:right w:val="single" w:sz="4" w:space="0" w:color="000000"/>
                 </w:tcBorders>
-                <w:shd w:val="clear" w:color="auto" w:fill="auto"/>
               </w:tcPr>
               <w:p>
                 <w:pPr>
@@ -1718,7 +1806,6 @@
                   <w:bottom w:val="single" w:sz="4" w:space="0" w:color="000000"/>
                   <w:right w:val="single" w:sz="4" w:space="0" w:color="000000"/>
                 </w:tcBorders>
-                <w:shd w:val="clear" w:color="auto" w:fill="auto"/>
               </w:tcPr>
               <w:p>
                 <w:pPr>
@@ -1781,8 +1868,8 @@
           <w:numId w:val="1"/>
         </w:numPr>
       </w:pPr>
-      <w:bookmarkStart w:id="8" w:name="_heading=h.1z9vpqyr8uml" w:colFirst="0" w:colLast="0"/>
-      <w:bookmarkEnd w:id="8"/>
+      <w:bookmarkStart w:id="7" w:name="_heading=h.1z9vpqyr8uml" w:colFirst="0" w:colLast="0"/>
+      <w:bookmarkEnd w:id="7"/>
       <w:r>
         <w:t xml:space="preserve">Seção: </w:t>
       </w:r>
@@ -1799,7 +1886,6 @@
         <w:id w:val="-1913991455"/>
         <w:lock w:val="contentLocked"/>
       </w:sdtPr>
-      <w:sdtEndPr/>
       <w:sdtContent>
         <w:tbl>
           <w:tblPr>
@@ -1823,7 +1909,6 @@
                   <w:bottom w:val="single" w:sz="4" w:space="0" w:color="000000"/>
                   <w:right w:val="single" w:sz="4" w:space="0" w:color="000000"/>
                 </w:tcBorders>
-                <w:shd w:val="clear" w:color="auto" w:fill="auto"/>
               </w:tcPr>
               <w:p>
                 <w:r>
@@ -1845,7 +1930,6 @@
                   <w:bottom w:val="single" w:sz="4" w:space="0" w:color="000000"/>
                   <w:right w:val="single" w:sz="4" w:space="0" w:color="000000"/>
                 </w:tcBorders>
-                <w:shd w:val="clear" w:color="auto" w:fill="auto"/>
               </w:tcPr>
               <w:p>
                 <w:r>
@@ -1872,7 +1956,6 @@
                   <w:bottom w:val="single" w:sz="4" w:space="0" w:color="000000"/>
                   <w:right w:val="single" w:sz="4" w:space="0" w:color="000000"/>
                 </w:tcBorders>
-                <w:shd w:val="clear" w:color="auto" w:fill="auto"/>
               </w:tcPr>
               <w:p>
                 <w:pPr>
@@ -1882,8 +1965,8 @@
                     <w:numId w:val="1"/>
                   </w:numPr>
                 </w:pPr>
-                <w:bookmarkStart w:id="9" w:name="_heading=h.n30rpezh0343" w:colFirst="0" w:colLast="0"/>
-                <w:bookmarkEnd w:id="9"/>
+                <w:bookmarkStart w:id="8" w:name="_heading=h.n30rpezh0343" w:colFirst="0" w:colLast="0"/>
+                <w:bookmarkEnd w:id="8"/>
                 <w:r>
                   <w:rPr>
                     <w:b/>
@@ -1907,7 +1990,6 @@
                   <w:bottom w:val="single" w:sz="4" w:space="0" w:color="000000"/>
                   <w:right w:val="single" w:sz="4" w:space="0" w:color="000000"/>
                 </w:tcBorders>
-                <w:shd w:val="clear" w:color="auto" w:fill="auto"/>
               </w:tcPr>
               <w:p>
                 <w:pPr>
@@ -1978,7 +2060,6 @@
                   <w:bottom w:val="single" w:sz="4" w:space="0" w:color="000000"/>
                   <w:right w:val="single" w:sz="4" w:space="0" w:color="000000"/>
                 </w:tcBorders>
-                <w:shd w:val="clear" w:color="auto" w:fill="auto"/>
               </w:tcPr>
               <w:p>
                 <w:pPr>
@@ -2012,7 +2093,6 @@
                   <w:bottom w:val="single" w:sz="4" w:space="0" w:color="000000"/>
                   <w:right w:val="single" w:sz="4" w:space="0" w:color="000000"/>
                 </w:tcBorders>
-                <w:shd w:val="clear" w:color="auto" w:fill="auto"/>
               </w:tcPr>
               <w:p>
                 <w:pPr>
@@ -2076,8 +2156,8 @@
           <w:numId w:val="1"/>
         </w:numPr>
       </w:pPr>
-      <w:bookmarkStart w:id="10" w:name="_heading=h.ue8c5f6zqe9j" w:colFirst="0" w:colLast="0"/>
-      <w:bookmarkEnd w:id="10"/>
+      <w:bookmarkStart w:id="9" w:name="_heading=h.ue8c5f6zqe9j" w:colFirst="0" w:colLast="0"/>
+      <w:bookmarkEnd w:id="9"/>
       <w:r>
         <w:t xml:space="preserve">Seção: </w:t>
       </w:r>
@@ -2094,7 +2174,6 @@
         <w:id w:val="-1809738486"/>
         <w:lock w:val="contentLocked"/>
       </w:sdtPr>
-      <w:sdtEndPr/>
       <w:sdtContent>
         <w:tbl>
           <w:tblPr>
@@ -2118,7 +2197,6 @@
                   <w:bottom w:val="single" w:sz="4" w:space="0" w:color="000000"/>
                   <w:right w:val="single" w:sz="4" w:space="0" w:color="000000"/>
                 </w:tcBorders>
-                <w:shd w:val="clear" w:color="auto" w:fill="auto"/>
               </w:tcPr>
               <w:p>
                 <w:r>
@@ -2140,7 +2218,6 @@
                   <w:bottom w:val="single" w:sz="4" w:space="0" w:color="000000"/>
                   <w:right w:val="single" w:sz="4" w:space="0" w:color="000000"/>
                 </w:tcBorders>
-                <w:shd w:val="clear" w:color="auto" w:fill="auto"/>
               </w:tcPr>
               <w:p>
                 <w:r>
@@ -2167,7 +2244,6 @@
                   <w:bottom w:val="single" w:sz="4" w:space="0" w:color="000000"/>
                   <w:right w:val="single" w:sz="4" w:space="0" w:color="000000"/>
                 </w:tcBorders>
-                <w:shd w:val="clear" w:color="auto" w:fill="auto"/>
               </w:tcPr>
               <w:p>
                 <w:pPr>
@@ -2177,12 +2253,13 @@
                     <w:numId w:val="1"/>
                   </w:numPr>
                 </w:pPr>
-                <w:bookmarkStart w:id="11" w:name="_heading=h.evtzf6337vtt" w:colFirst="0" w:colLast="0"/>
-                <w:bookmarkEnd w:id="11"/>
+                <w:bookmarkStart w:id="10" w:name="_heading=h.evtzf6337vtt" w:colFirst="0" w:colLast="0"/>
+                <w:bookmarkEnd w:id="10"/>
                 <w:r>
                   <w:rPr>
                     <w:b/>
                   </w:rPr>
+                  <w:lastRenderedPageBreak/>
                   <w:t>Fluxo Principal</w:t>
                 </w:r>
               </w:p>
@@ -2202,7 +2279,6 @@
                   <w:bottom w:val="single" w:sz="4" w:space="0" w:color="000000"/>
                   <w:right w:val="single" w:sz="4" w:space="0" w:color="000000"/>
                 </w:tcBorders>
-                <w:shd w:val="clear" w:color="auto" w:fill="auto"/>
               </w:tcPr>
               <w:p>
                 <w:pPr>
@@ -2291,7 +2367,6 @@
                     <w:sz w:val="28"/>
                     <w:szCs w:val="28"/>
                   </w:rPr>
-                  <w:lastRenderedPageBreak/>
                   <w:t xml:space="preserve">4. Ator pressiona o ícone de algum restaurante. Ver </w:t>
                 </w:r>
                 <w:r>
@@ -2319,7 +2394,6 @@
                   <w:bottom w:val="single" w:sz="4" w:space="0" w:color="000000"/>
                   <w:right w:val="single" w:sz="4" w:space="0" w:color="000000"/>
                 </w:tcBorders>
-                <w:shd w:val="clear" w:color="auto" w:fill="auto"/>
               </w:tcPr>
               <w:p>
                 <w:pPr>
@@ -2334,7 +2408,6 @@
                     <w:sz w:val="28"/>
                     <w:szCs w:val="28"/>
                   </w:rPr>
-                  <w:lastRenderedPageBreak/>
                   <w:t>Fluxo de Exceção</w:t>
                 </w:r>
               </w:p>
@@ -2354,7 +2427,6 @@
                   <w:bottom w:val="single" w:sz="4" w:space="0" w:color="000000"/>
                   <w:right w:val="single" w:sz="4" w:space="0" w:color="000000"/>
                 </w:tcBorders>
-                <w:shd w:val="clear" w:color="auto" w:fill="auto"/>
               </w:tcPr>
               <w:p>
                 <w:pPr>
@@ -2396,8 +2468,8 @@
           <w:numId w:val="1"/>
         </w:numPr>
       </w:pPr>
-      <w:bookmarkStart w:id="12" w:name="_heading=h.vq3hpfpczc7q" w:colFirst="0" w:colLast="0"/>
-      <w:bookmarkEnd w:id="12"/>
+      <w:bookmarkStart w:id="11" w:name="_heading=h.vq3hpfpczc7q" w:colFirst="0" w:colLast="0"/>
+      <w:bookmarkEnd w:id="11"/>
     </w:p>
     <w:p>
       <w:pPr>
@@ -2437,7 +2509,6 @@
               <w:bottom w:val="single" w:sz="4" w:space="0" w:color="000000"/>
               <w:right w:val="single" w:sz="4" w:space="0" w:color="000000"/>
             </w:tcBorders>
-            <w:shd w:val="clear" w:color="auto" w:fill="auto"/>
           </w:tcPr>
           <w:p>
             <w:pPr>
@@ -2464,7 +2535,6 @@
               <w:bottom w:val="single" w:sz="4" w:space="0" w:color="000000"/>
               <w:right w:val="single" w:sz="4" w:space="0" w:color="000000"/>
             </w:tcBorders>
-            <w:shd w:val="clear" w:color="auto" w:fill="auto"/>
           </w:tcPr>
           <w:p>
             <w:pPr>
@@ -2484,7 +2554,6 @@
               <w:bottom w:val="single" w:sz="4" w:space="0" w:color="000000"/>
               <w:right w:val="single" w:sz="4" w:space="0" w:color="000000"/>
             </w:tcBorders>
-            <w:shd w:val="clear" w:color="auto" w:fill="auto"/>
           </w:tcPr>
           <w:p>
             <w:pPr>
@@ -2504,7 +2573,6 @@
               <w:bottom w:val="single" w:sz="4" w:space="0" w:color="000000"/>
               <w:right w:val="single" w:sz="4" w:space="0" w:color="000000"/>
             </w:tcBorders>
-            <w:shd w:val="clear" w:color="auto" w:fill="auto"/>
           </w:tcPr>
           <w:p>
             <w:pPr>
@@ -2526,7 +2594,6 @@
               <w:bottom w:val="single" w:sz="4" w:space="0" w:color="000000"/>
               <w:right w:val="single" w:sz="4" w:space="0" w:color="000000"/>
             </w:tcBorders>
-            <w:shd w:val="clear" w:color="auto" w:fill="auto"/>
           </w:tcPr>
           <w:p>
             <w:pPr>
@@ -2546,7 +2613,6 @@
               <w:bottom w:val="single" w:sz="4" w:space="0" w:color="000000"/>
               <w:right w:val="single" w:sz="4" w:space="0" w:color="000000"/>
             </w:tcBorders>
-            <w:shd w:val="clear" w:color="auto" w:fill="auto"/>
           </w:tcPr>
           <w:p>
             <w:pPr>
@@ -2566,7 +2632,6 @@
               <w:bottom w:val="single" w:sz="4" w:space="0" w:color="000000"/>
               <w:right w:val="single" w:sz="4" w:space="0" w:color="000000"/>
             </w:tcBorders>
-            <w:shd w:val="clear" w:color="auto" w:fill="auto"/>
           </w:tcPr>
           <w:p>
             <w:pPr>
@@ -2593,7 +2658,6 @@
               <w:bottom w:val="single" w:sz="4" w:space="0" w:color="000000"/>
               <w:right w:val="single" w:sz="4" w:space="0" w:color="000000"/>
             </w:tcBorders>
-            <w:shd w:val="clear" w:color="auto" w:fill="auto"/>
           </w:tcPr>
           <w:p>
             <w:pPr>
@@ -2613,7 +2677,6 @@
               <w:bottom w:val="single" w:sz="4" w:space="0" w:color="000000"/>
               <w:right w:val="single" w:sz="4" w:space="0" w:color="000000"/>
             </w:tcBorders>
-            <w:shd w:val="clear" w:color="auto" w:fill="auto"/>
           </w:tcPr>
           <w:p>
             <w:pPr>
@@ -2633,7 +2696,6 @@
               <w:bottom w:val="single" w:sz="4" w:space="0" w:color="000000"/>
               <w:right w:val="single" w:sz="4" w:space="0" w:color="000000"/>
             </w:tcBorders>
-            <w:shd w:val="clear" w:color="auto" w:fill="auto"/>
           </w:tcPr>
           <w:p>
             <w:pPr>
@@ -2655,7 +2717,6 @@
               <w:bottom w:val="single" w:sz="4" w:space="0" w:color="000000"/>
               <w:right w:val="single" w:sz="4" w:space="0" w:color="000000"/>
             </w:tcBorders>
-            <w:shd w:val="clear" w:color="auto" w:fill="auto"/>
           </w:tcPr>
           <w:p>
             <w:pPr>
@@ -2675,7 +2736,6 @@
               <w:bottom w:val="single" w:sz="4" w:space="0" w:color="000000"/>
               <w:right w:val="single" w:sz="4" w:space="0" w:color="000000"/>
             </w:tcBorders>
-            <w:shd w:val="clear" w:color="auto" w:fill="auto"/>
           </w:tcPr>
           <w:p>
             <w:pPr>
@@ -2695,7 +2755,6 @@
               <w:bottom w:val="single" w:sz="4" w:space="0" w:color="000000"/>
               <w:right w:val="single" w:sz="4" w:space="0" w:color="000000"/>
             </w:tcBorders>
-            <w:shd w:val="clear" w:color="auto" w:fill="auto"/>
           </w:tcPr>
           <w:p>
             <w:pPr>
@@ -2720,7 +2779,7 @@
 </file>
 
 <file path=word/numbering.xml><?xml version="1.0" encoding="utf-8"?>
-<w:numbering xmlns:wpc="http://schemas.microsoft.com/office/word/2010/wordprocessingCanvas" xmlns:cx="http://schemas.microsoft.com/office/drawing/2014/chartex" xmlns:cx1="http://schemas.microsoft.com/office/drawing/2015/9/8/chartex" xmlns:cx2="http://schemas.microsoft.com/office/drawing/2015/10/21/chartex" xmlns:cx3="http://schemas.microsoft.com/office/drawing/2016/5/9/chartex" xmlns:cx4="http://schemas.microsoft.com/office/drawing/2016/5/10/chartex" xmlns:cx5="http://schemas.microsoft.com/office/drawing/2016/5/11/chartex" xmlns:cx6="http://schemas.microsoft.com/office/drawing/2016/5/12/chartex" xmlns:cx7="http://schemas.microsoft.com/office/drawing/2016/5/13/chartex" xmlns:cx8="http://schemas.microsoft.com/office/drawing/2016/5/14/chartex" xmlns:mc="http://schemas.openxmlformats.org/markup-compatibility/2006" xmlns:aink="http://schemas.microsoft.com/office/drawing/2016/ink" xmlns:am3d="http://schemas.microsoft.com/office/drawing/2017/model3d" xmlns:o="urn:schemas-microsoft-com:office:office" xmlns:r="http://schemas.openxmlformats.org/officeDocument/2006/relationships" xmlns:m="http://schemas.openxmlformats.org/officeDocument/2006/math" xmlns:v="urn:schemas-microsoft-com:vml" xmlns:wp14="http://schemas.microsoft.com/office/word/2010/wordprocessingDrawing" xmlns:wp="http://schemas.openxmlformats.org/drawingml/2006/wordprocessingDrawing" xmlns:w10="urn:schemas-microsoft-com:office:word" xmlns:w="http://schemas.openxmlformats.org/wordprocessingml/2006/main" xmlns:w14="http://schemas.microsoft.com/office/word/2010/wordml" xmlns:w15="http://schemas.microsoft.com/office/word/2012/wordml" xmlns:w16cex="http://schemas.microsoft.com/office/word/2018/wordml/cex" xmlns:w16cid="http://schemas.microsoft.com/office/word/2016/wordml/cid" xmlns:w16="http://schemas.microsoft.com/office/word/2018/wordml" xmlns:w16se="http://schemas.microsoft.com/office/word/2015/wordml/symex" xmlns:wpg="http://schemas.microsoft.com/office/word/2010/wordprocessingGroup" xmlns:wpi="http://schemas.microsoft.com/office/word/2010/wordprocessingInk" xmlns:wne="http://schemas.microsoft.com/office/word/2006/wordml" xmlns:wps="http://schemas.microsoft.com/office/word/2010/wordprocessingShape" mc:Ignorable="w14 w15 w16se w16cid w16 w16cex wp14">
+<w:numbering xmlns:wpc="http://schemas.microsoft.com/office/word/2010/wordprocessingCanvas" xmlns:cx="http://schemas.microsoft.com/office/drawing/2014/chartex" xmlns:cx1="http://schemas.microsoft.com/office/drawing/2015/9/8/chartex" xmlns:cx2="http://schemas.microsoft.com/office/drawing/2015/10/21/chartex" xmlns:cx3="http://schemas.microsoft.com/office/drawing/2016/5/9/chartex" xmlns:cx4="http://schemas.microsoft.com/office/drawing/2016/5/10/chartex" xmlns:cx5="http://schemas.microsoft.com/office/drawing/2016/5/11/chartex" xmlns:cx6="http://schemas.microsoft.com/office/drawing/2016/5/12/chartex" xmlns:cx7="http://schemas.microsoft.com/office/drawing/2016/5/13/chartex" xmlns:cx8="http://schemas.microsoft.com/office/drawing/2016/5/14/chartex" xmlns:mc="http://schemas.openxmlformats.org/markup-compatibility/2006" xmlns:aink="http://schemas.microsoft.com/office/drawing/2016/ink" xmlns:am3d="http://schemas.microsoft.com/office/drawing/2017/model3d" xmlns:o="urn:schemas-microsoft-com:office:office" xmlns:oel="http://schemas.microsoft.com/office/2019/extlst" xmlns:r="http://schemas.openxmlformats.org/officeDocument/2006/relationships" xmlns:m="http://schemas.openxmlformats.org/officeDocument/2006/math" xmlns:v="urn:schemas-microsoft-com:vml" xmlns:wp14="http://schemas.microsoft.com/office/word/2010/wordprocessingDrawing" xmlns:wp="http://schemas.openxmlformats.org/drawingml/2006/wordprocessingDrawing" xmlns:w10="urn:schemas-microsoft-com:office:word" xmlns:w="http://schemas.openxmlformats.org/wordprocessingml/2006/main" xmlns:w14="http://schemas.microsoft.com/office/word/2010/wordml" xmlns:w15="http://schemas.microsoft.com/office/word/2012/wordml" xmlns:w16cex="http://schemas.microsoft.com/office/word/2018/wordml/cex" xmlns:w16cid="http://schemas.microsoft.com/office/word/2016/wordml/cid" xmlns:w16="http://schemas.microsoft.com/office/word/2018/wordml" xmlns:w16du="http://schemas.microsoft.com/office/word/2023/wordml/word16du" xmlns:w16sdtdh="http://schemas.microsoft.com/office/word/2020/wordml/sdtdatahash" xmlns:w16sdtfl="http://schemas.microsoft.com/office/word/2024/wordml/sdtformatlock" xmlns:w16se="http://schemas.microsoft.com/office/word/2015/wordml/symex" xmlns:wpg="http://schemas.microsoft.com/office/word/2010/wordprocessingGroup" xmlns:wpi="http://schemas.microsoft.com/office/word/2010/wordprocessingInk" xmlns:wne="http://schemas.microsoft.com/office/word/2006/wordml" xmlns:wps="http://schemas.microsoft.com/office/word/2010/wordprocessingShape" mc:Ignorable="w14 w15 w16se w16cid w16 w16cex w16sdtdh w16sdtfl w16du wp14">
   <w:abstractNum w:abstractNumId="0" w15:restartNumberingAfterBreak="0">
     <w:nsid w:val="02227658"/>
     <w:multiLevelType w:val="multilevel"/>
@@ -2923,17 +2982,17 @@
       </w:rPr>
     </w:lvl>
   </w:abstractNum>
-  <w:num w:numId="1">
+  <w:num w:numId="1" w16cid:durableId="2055156933">
     <w:abstractNumId w:val="1"/>
   </w:num>
-  <w:num w:numId="2">
+  <w:num w:numId="2" w16cid:durableId="1554150973">
     <w:abstractNumId w:val="0"/>
   </w:num>
 </w:numbering>
 </file>
 
 <file path=word/styles.xml><?xml version="1.0" encoding="utf-8"?>
-<w:styles xmlns:mc="http://schemas.openxmlformats.org/markup-compatibility/2006" xmlns:r="http://schemas.openxmlformats.org/officeDocument/2006/relationships" xmlns:w="http://schemas.openxmlformats.org/wordprocessingml/2006/main" xmlns:w14="http://schemas.microsoft.com/office/word/2010/wordml" xmlns:w15="http://schemas.microsoft.com/office/word/2012/wordml" xmlns:w16cex="http://schemas.microsoft.com/office/word/2018/wordml/cex" xmlns:w16cid="http://schemas.microsoft.com/office/word/2016/wordml/cid" xmlns:w16="http://schemas.microsoft.com/office/word/2018/wordml" xmlns:w16se="http://schemas.microsoft.com/office/word/2015/wordml/symex" mc:Ignorable="w14 w15 w16se w16cid w16 w16cex">
+<w:styles xmlns:mc="http://schemas.openxmlformats.org/markup-compatibility/2006" xmlns:r="http://schemas.openxmlformats.org/officeDocument/2006/relationships" xmlns:w="http://schemas.openxmlformats.org/wordprocessingml/2006/main" xmlns:w14="http://schemas.microsoft.com/office/word/2010/wordml" xmlns:w15="http://schemas.microsoft.com/office/word/2012/wordml" xmlns:w16cex="http://schemas.microsoft.com/office/word/2018/wordml/cex" xmlns:w16cid="http://schemas.microsoft.com/office/word/2016/wordml/cid" xmlns:w16="http://schemas.microsoft.com/office/word/2018/wordml" xmlns:w16du="http://schemas.microsoft.com/office/word/2023/wordml/word16du" xmlns:w16sdtdh="http://schemas.microsoft.com/office/word/2020/wordml/sdtdatahash" xmlns:w16sdtfl="http://schemas.microsoft.com/office/word/2024/wordml/sdtformatlock" xmlns:w16se="http://schemas.microsoft.com/office/word/2015/wordml/symex" mc:Ignorable="w14 w15 w16se w16cid w16 w16cex w16sdtdh w16sdtfl w16du">
   <w:docDefaults>
     <w:rPrDefault>
       <w:rPr>
@@ -3611,7 +3670,7 @@
     <w:basedOn w:val="Normal"/>
     <w:pPr>
       <w:spacing w:line="1" w:lineRule="atLeast"/>
-      <w:ind w:leftChars="-1" w:left="284" w:hangingChars="1"/>
+      <w:ind w:leftChars="-1" w:left="284" w:hangingChars="1" w:hanging="1"/>
       <w:textDirection w:val="btLr"/>
       <w:textAlignment w:val="top"/>
       <w:outlineLvl w:val="0"/>
@@ -3676,9 +3735,7 @@
       <w:tblStyleRowBandSize w:val="1"/>
       <w:tblStyleColBandSize w:val="1"/>
       <w:tblCellMar>
-        <w:top w:w="0" w:type="dxa"/>
         <w:left w:w="70" w:type="dxa"/>
-        <w:bottom w:w="0" w:type="dxa"/>
         <w:right w:w="70" w:type="dxa"/>
       </w:tblCellMar>
     </w:tblPr>
@@ -3689,9 +3746,7 @@
       <w:tblStyleRowBandSize w:val="1"/>
       <w:tblStyleColBandSize w:val="1"/>
       <w:tblCellMar>
-        <w:top w:w="0" w:type="dxa"/>
         <w:left w:w="70" w:type="dxa"/>
-        <w:bottom w:w="0" w:type="dxa"/>
         <w:right w:w="70" w:type="dxa"/>
       </w:tblCellMar>
     </w:tblPr>
@@ -3702,9 +3757,7 @@
       <w:tblStyleRowBandSize w:val="1"/>
       <w:tblStyleColBandSize w:val="1"/>
       <w:tblCellMar>
-        <w:top w:w="0" w:type="dxa"/>
         <w:left w:w="70" w:type="dxa"/>
-        <w:bottom w:w="0" w:type="dxa"/>
         <w:right w:w="70" w:type="dxa"/>
       </w:tblCellMar>
     </w:tblPr>
@@ -3715,9 +3768,7 @@
       <w:tblStyleRowBandSize w:val="1"/>
       <w:tblStyleColBandSize w:val="1"/>
       <w:tblCellMar>
-        <w:top w:w="0" w:type="dxa"/>
         <w:left w:w="70" w:type="dxa"/>
-        <w:bottom w:w="0" w:type="dxa"/>
         <w:right w:w="70" w:type="dxa"/>
       </w:tblCellMar>
     </w:tblPr>
@@ -3728,9 +3779,7 @@
       <w:tblStyleRowBandSize w:val="1"/>
       <w:tblStyleColBandSize w:val="1"/>
       <w:tblCellMar>
-        <w:top w:w="0" w:type="dxa"/>
         <w:left w:w="70" w:type="dxa"/>
-        <w:bottom w:w="0" w:type="dxa"/>
         <w:right w:w="70" w:type="dxa"/>
       </w:tblCellMar>
     </w:tblPr>
@@ -3741,9 +3790,7 @@
       <w:tblStyleRowBandSize w:val="1"/>
       <w:tblStyleColBandSize w:val="1"/>
       <w:tblCellMar>
-        <w:top w:w="0" w:type="dxa"/>
         <w:left w:w="108" w:type="dxa"/>
-        <w:bottom w:w="0" w:type="dxa"/>
         <w:right w:w="108" w:type="dxa"/>
       </w:tblCellMar>
     </w:tblPr>

</xml_diff>